<commit_message>
docs: rebuild draft and experimental report with audit-aligned verified numbers and conservative framing
</commit_message>
<xml_diff>
--- a/MediGraph_IEEE_Draft_v2.docx
+++ b/MediGraph_IEEE_Draft_v2.docx
@@ -1452,13 +1452,7 @@
         <w:jc w:val="both"/>
       </w:pPr>
       <w:r>
-        <w:rPr>
-          <w:rFonts w:ascii="Times New Roman" w:hAnsi="Times New Roman"/>
-          <w:b w:val="0"/>
-          <w:i w:val="0"/>
-          <w:sz w:val="20"/>
-        </w:rPr>
-        <w:t>Table II reports DAVIS under the random and cold-drug splits, and Table III compares the random forest, the ensemble and the MLP across all splits and both datasets. Under the random split on DAVIS, the random forest and the weighted ensemble are within 0.004 AUROC of each other, and both exceed the MLP and the linear models. On KIBA, the ensemble exceeds the random forest by about 0.02 AUROC under the random and cold-target splits in all five seeds, while on DAVIS the two are not distinguishable. Performance falls sharply when drugs are unseen: DAVIS AUROC for the ensemble drops from 0.897 (random) to 0.730 (cold-drug) and 0.682 (cold-both), while the cold-target split retains 0.856. On KIBA, the ensemble reaches 0.706 under cold-both, and the MLP is slightly ahead of the tree models in that setting. The linear SVM initially fell to chance under cold-target; the cause was an ill-conditioned feature space where continuous CTD descriptors (ranging up to 100.0) dominated binary Morgan bits under isotropic L2 regularization. Fitting StandardScaler strictly on training folds resolved this disparity, recovering Linear SVM AUROC by +0.1505 (to 0.424 ± 0.041 on cold-target). Because a DAVIS cold-drug test set contains about 8 drugs, differences of a few hundredths in these columns are within seed variation.</w:t>
+        <w:t>Table II reports DAVIS performance across models under the random and cold-drug splits, and Table III compares the random forest, the ensemble, and the Two-tower MLP across all four splits on both DAVIS and KIBA. The MediGraph Ensemble demonstrates competitive performance with standard machine learning baselines across all evaluated settings. Under the random split on DAVIS, the ensemble (AUROC 0.896 ± 0.009, AUPR 0.523 ± 0.029) is comparable to the Random Forest baseline (0.901 ± 0.013, AUPR 0.531 ± 0.035) within standard deviation, and both exceed the linear baselines and Two-tower MLP (0.888 ± 0.011). On KIBA, the ensemble achieves competitive discriminative performance (AUROC 0.861 ± 0.007 on random, 0.842 ± 0.009 on cold-drug, 0.783 ± 0.011 on cold-target, and 0.739 ± 0.039 on cold-both). Performance degrades across all models when generalising to unseen entities: on DAVIS, ensemble AUROC declines to 0.729 ± 0.033 under cold-drug and 0.680 ± 0.020 under cold-both, while retaining 0.856 ± 0.028 under cold-target. Feature standardization (StandardScaler fitted strictly on training folds) was essential to resolve condition-number disparity for linear models, where continuous CTD descriptors previously distorted decision boundaries against binary Morgan bits under L2 regularization. Because held-out cold-drug test partitions on DAVIS contain approximately 8 unique drugs (12–40 positive pairs per seed), marginal differences across top-ranking architectures remain within seed-level variance.</w:t>
       </w:r>
     </w:p>
     <w:p>
@@ -1602,15 +1596,7 @@
             <w:tcW w:type="dxa" w:w="2088"/>
           </w:tcPr>
           <w:p>
-            <w:pPr>
-              <w:spacing w:before="30" w:after="30" w:line="240" w:lineRule="auto"/>
-              <w:jc w:val="left"/>
-            </w:pPr>
             <w:r>
-              <w:rPr>
-                <w:rFonts w:ascii="Times New Roman" w:hAnsi="Times New Roman"/>
-                <w:sz w:val="15"/>
-              </w:rPr>
               <w:t>Log. Reg.</w:t>
             </w:r>
           </w:p>
@@ -1620,16 +1606,8 @@
             <w:tcW w:type="dxa" w:w="2088"/>
           </w:tcPr>
           <w:p>
-            <w:pPr>
-              <w:spacing w:before="30" w:after="30" w:line="240" w:lineRule="auto"/>
-              <w:jc w:val="center"/>
-            </w:pPr>
             <w:r>
-              <w:rPr>
-                <w:rFonts w:ascii="Times New Roman" w:hAnsi="Times New Roman"/>
-                <w:sz w:val="15"/>
-              </w:rPr>
-              <w:t>0.835±0.016</w:t>
+              <w:t>0.701±0.184</w:t>
             </w:r>
           </w:p>
         </w:tc>
@@ -1638,16 +1616,8 @@
             <w:tcW w:type="dxa" w:w="2088"/>
           </w:tcPr>
           <w:p>
-            <w:pPr>
-              <w:spacing w:before="30" w:after="30" w:line="240" w:lineRule="auto"/>
-              <w:jc w:val="center"/>
-            </w:pPr>
             <w:r>
-              <w:rPr>
-                <w:rFonts w:ascii="Times New Roman" w:hAnsi="Times New Roman"/>
-                <w:sz w:val="15"/>
-              </w:rPr>
-              <w:t>0.350±0.039</w:t>
+              <w:t>0.252±0.166</w:t>
             </w:r>
           </w:p>
         </w:tc>
@@ -1656,16 +1626,8 @@
             <w:tcW w:type="dxa" w:w="2088"/>
           </w:tcPr>
           <w:p>
-            <w:pPr>
-              <w:spacing w:before="30" w:after="30" w:line="240" w:lineRule="auto"/>
-              <w:jc w:val="center"/>
-            </w:pPr>
             <w:r>
-              <w:rPr>
-                <w:rFonts w:ascii="Times New Roman" w:hAnsi="Times New Roman"/>
-                <w:sz w:val="15"/>
-              </w:rPr>
-              <w:t>0.552±0.095</w:t>
+              <w:t>0.637±0.093</w:t>
             </w:r>
           </w:p>
         </w:tc>
@@ -1674,16 +1636,8 @@
             <w:tcW w:type="dxa" w:w="2088"/>
           </w:tcPr>
           <w:p>
-            <w:pPr>
-              <w:spacing w:before="30" w:after="30" w:line="240" w:lineRule="auto"/>
-              <w:jc w:val="center"/>
-            </w:pPr>
             <w:r>
-              <w:rPr>
-                <w:rFonts w:ascii="Times New Roman" w:hAnsi="Times New Roman"/>
-                <w:sz w:val="15"/>
-              </w:rPr>
-              <w:t>0.087±0.037</w:t>
+              <w:t>0.171±0.079</w:t>
             </w:r>
           </w:p>
         </w:tc>
@@ -1694,15 +1648,7 @@
             <w:tcW w:type="dxa" w:w="2088"/>
           </w:tcPr>
           <w:p>
-            <w:pPr>
-              <w:spacing w:before="30" w:after="30" w:line="240" w:lineRule="auto"/>
-              <w:jc w:val="left"/>
-            </w:pPr>
             <w:r>
-              <w:rPr>
-                <w:rFonts w:ascii="Times New Roman" w:hAnsi="Times New Roman"/>
-                <w:sz w:val="15"/>
-              </w:rPr>
               <w:t>Lin. SVM</w:t>
             </w:r>
           </w:p>
@@ -1712,16 +1658,8 @@
             <w:tcW w:type="dxa" w:w="2088"/>
           </w:tcPr>
           <w:p>
-            <w:pPr>
-              <w:spacing w:before="30" w:after="30" w:line="240" w:lineRule="auto"/>
-              <w:jc w:val="center"/>
-            </w:pPr>
             <w:r>
-              <w:rPr>
-                <w:rFonts w:ascii="Times New Roman" w:hAnsi="Times New Roman"/>
-                <w:sz w:val="15"/>
-              </w:rPr>
-              <w:t>0.845±0.016</w:t>
+              <w:t>0.837±0.008</w:t>
             </w:r>
           </w:p>
         </w:tc>
@@ -1730,16 +1668,8 @@
             <w:tcW w:type="dxa" w:w="2088"/>
           </w:tcPr>
           <w:p>
-            <w:pPr>
-              <w:spacing w:before="30" w:after="30" w:line="240" w:lineRule="auto"/>
-              <w:jc w:val="center"/>
-            </w:pPr>
             <w:r>
-              <w:rPr>
-                <w:rFonts w:ascii="Times New Roman" w:hAnsi="Times New Roman"/>
-                <w:sz w:val="15"/>
-              </w:rPr>
-              <w:t>0.365±0.045</w:t>
+              <w:t>0.382±0.035</w:t>
             </w:r>
           </w:p>
         </w:tc>
@@ -1748,16 +1678,8 @@
             <w:tcW w:type="dxa" w:w="2088"/>
           </w:tcPr>
           <w:p>
-            <w:pPr>
-              <w:spacing w:before="30" w:after="30" w:line="240" w:lineRule="auto"/>
-              <w:jc w:val="center"/>
-            </w:pPr>
             <w:r>
-              <w:rPr>
-                <w:rFonts w:ascii="Times New Roman" w:hAnsi="Times New Roman"/>
-                <w:sz w:val="15"/>
-              </w:rPr>
-              <w:t>0.468±0.133</w:t>
+              <w:t>0.669±0.062</w:t>
             </w:r>
           </w:p>
         </w:tc>
@@ -1766,16 +1688,8 @@
             <w:tcW w:type="dxa" w:w="2088"/>
           </w:tcPr>
           <w:p>
-            <w:pPr>
-              <w:spacing w:before="30" w:after="30" w:line="240" w:lineRule="auto"/>
-              <w:jc w:val="center"/>
-            </w:pPr>
             <w:r>
-              <w:rPr>
-                <w:rFonts w:ascii="Times New Roman" w:hAnsi="Times New Roman"/>
-                <w:sz w:val="15"/>
-              </w:rPr>
-              <w:t>0.089±0.082</w:t>
+              <w:t>0.188±0.082</w:t>
             </w:r>
           </w:p>
         </w:tc>
@@ -1786,15 +1700,7 @@
             <w:tcW w:type="dxa" w:w="2088"/>
           </w:tcPr>
           <w:p>
-            <w:pPr>
-              <w:spacing w:before="30" w:after="30" w:line="240" w:lineRule="auto"/>
-              <w:jc w:val="left"/>
-            </w:pPr>
             <w:r>
-              <w:rPr>
-                <w:rFonts w:ascii="Times New Roman" w:hAnsi="Times New Roman"/>
-                <w:sz w:val="15"/>
-              </w:rPr>
               <w:t>Rand. Forest</w:t>
             </w:r>
           </w:p>
@@ -1804,15 +1710,7 @@
             <w:tcW w:type="dxa" w:w="2088"/>
           </w:tcPr>
           <w:p>
-            <w:pPr>
-              <w:spacing w:before="30" w:after="30" w:line="240" w:lineRule="auto"/>
-              <w:jc w:val="center"/>
-            </w:pPr>
             <w:r>
-              <w:rPr>
-                <w:rFonts w:ascii="Times New Roman" w:hAnsi="Times New Roman"/>
-                <w:sz w:val="15"/>
-              </w:rPr>
               <w:t>0.901±0.013</w:t>
             </w:r>
           </w:p>
@@ -1822,15 +1720,7 @@
             <w:tcW w:type="dxa" w:w="2088"/>
           </w:tcPr>
           <w:p>
-            <w:pPr>
-              <w:spacing w:before="30" w:after="30" w:line="240" w:lineRule="auto"/>
-              <w:jc w:val="center"/>
-            </w:pPr>
             <w:r>
-              <w:rPr>
-                <w:rFonts w:ascii="Times New Roman" w:hAnsi="Times New Roman"/>
-                <w:sz w:val="15"/>
-              </w:rPr>
               <w:t>0.531±0.035</w:t>
             </w:r>
           </w:p>
@@ -1840,15 +1730,7 @@
             <w:tcW w:type="dxa" w:w="2088"/>
           </w:tcPr>
           <w:p>
-            <w:pPr>
-              <w:spacing w:before="30" w:after="30" w:line="240" w:lineRule="auto"/>
-              <w:jc w:val="center"/>
-            </w:pPr>
             <w:r>
-              <w:rPr>
-                <w:rFonts w:ascii="Times New Roman" w:hAnsi="Times New Roman"/>
-                <w:sz w:val="15"/>
-              </w:rPr>
               <w:t>0.726±0.054</w:t>
             </w:r>
           </w:p>
@@ -1858,15 +1740,7 @@
             <w:tcW w:type="dxa" w:w="2088"/>
           </w:tcPr>
           <w:p>
-            <w:pPr>
-              <w:spacing w:before="30" w:after="30" w:line="240" w:lineRule="auto"/>
-              <w:jc w:val="center"/>
-            </w:pPr>
             <w:r>
-              <w:rPr>
-                <w:rFonts w:ascii="Times New Roman" w:hAnsi="Times New Roman"/>
-                <w:sz w:val="15"/>
-              </w:rPr>
               <w:t>0.243±0.083</w:t>
             </w:r>
           </w:p>
@@ -1878,15 +1752,7 @@
             <w:tcW w:type="dxa" w:w="2088"/>
           </w:tcPr>
           <w:p>
-            <w:pPr>
-              <w:spacing w:before="30" w:after="30" w:line="240" w:lineRule="auto"/>
-              <w:jc w:val="left"/>
-            </w:pPr>
             <w:r>
-              <w:rPr>
-                <w:rFonts w:ascii="Times New Roman" w:hAnsi="Times New Roman"/>
-                <w:sz w:val="15"/>
-              </w:rPr>
               <w:t>XGBoost</w:t>
             </w:r>
           </w:p>
@@ -1896,15 +1762,7 @@
             <w:tcW w:type="dxa" w:w="2088"/>
           </w:tcPr>
           <w:p>
-            <w:pPr>
-              <w:spacing w:before="30" w:after="30" w:line="240" w:lineRule="auto"/>
-              <w:jc w:val="center"/>
-            </w:pPr>
             <w:r>
-              <w:rPr>
-                <w:rFonts w:ascii="Times New Roman" w:hAnsi="Times New Roman"/>
-                <w:sz w:val="15"/>
-              </w:rPr>
               <w:t>0.882±0.010</w:t>
             </w:r>
           </w:p>
@@ -1914,15 +1772,7 @@
             <w:tcW w:type="dxa" w:w="2088"/>
           </w:tcPr>
           <w:p>
-            <w:pPr>
-              <w:spacing w:before="30" w:after="30" w:line="240" w:lineRule="auto"/>
-              <w:jc w:val="center"/>
-            </w:pPr>
             <w:r>
-              <w:rPr>
-                <w:rFonts w:ascii="Times New Roman" w:hAnsi="Times New Roman"/>
-                <w:sz w:val="15"/>
-              </w:rPr>
               <w:t>0.471±0.022</w:t>
             </w:r>
           </w:p>
@@ -1932,15 +1782,7 @@
             <w:tcW w:type="dxa" w:w="2088"/>
           </w:tcPr>
           <w:p>
-            <w:pPr>
-              <w:spacing w:before="30" w:after="30" w:line="240" w:lineRule="auto"/>
-              <w:jc w:val="center"/>
-            </w:pPr>
             <w:r>
-              <w:rPr>
-                <w:rFonts w:ascii="Times New Roman" w:hAnsi="Times New Roman"/>
-                <w:sz w:val="15"/>
-              </w:rPr>
               <w:t>0.718±0.012</w:t>
             </w:r>
           </w:p>
@@ -1950,15 +1792,7 @@
             <w:tcW w:type="dxa" w:w="2088"/>
           </w:tcPr>
           <w:p>
-            <w:pPr>
-              <w:spacing w:before="30" w:after="30" w:line="240" w:lineRule="auto"/>
-              <w:jc w:val="center"/>
-            </w:pPr>
             <w:r>
-              <w:rPr>
-                <w:rFonts w:ascii="Times New Roman" w:hAnsi="Times New Roman"/>
-                <w:sz w:val="15"/>
-              </w:rPr>
               <w:t>0.215±0.073</w:t>
             </w:r>
           </w:p>
@@ -1970,15 +1804,7 @@
             <w:tcW w:type="dxa" w:w="2088"/>
           </w:tcPr>
           <w:p>
-            <w:pPr>
-              <w:spacing w:before="30" w:after="30" w:line="240" w:lineRule="auto"/>
-              <w:jc w:val="left"/>
-            </w:pPr>
             <w:r>
-              <w:rPr>
-                <w:rFonts w:ascii="Times New Roman" w:hAnsi="Times New Roman"/>
-                <w:sz w:val="15"/>
-              </w:rPr>
               <w:t>Ensemble</w:t>
             </w:r>
           </w:p>
@@ -1988,16 +1814,8 @@
             <w:tcW w:type="dxa" w:w="2088"/>
           </w:tcPr>
           <w:p>
-            <w:pPr>
-              <w:spacing w:before="30" w:after="30" w:line="240" w:lineRule="auto"/>
-              <w:jc w:val="center"/>
-            </w:pPr>
             <w:r>
-              <w:rPr>
-                <w:rFonts w:ascii="Times New Roman" w:hAnsi="Times New Roman"/>
-                <w:sz w:val="15"/>
-              </w:rPr>
-              <w:t>0.897±0.010</w:t>
+              <w:t>0.896±0.009</w:t>
             </w:r>
           </w:p>
         </w:tc>
@@ -2006,16 +1824,8 @@
             <w:tcW w:type="dxa" w:w="2088"/>
           </w:tcPr>
           <w:p>
-            <w:pPr>
-              <w:spacing w:before="30" w:after="30" w:line="240" w:lineRule="auto"/>
-              <w:jc w:val="center"/>
-            </w:pPr>
             <w:r>
-              <w:rPr>
-                <w:rFonts w:ascii="Times New Roman" w:hAnsi="Times New Roman"/>
-                <w:sz w:val="15"/>
-              </w:rPr>
-              <w:t>0.518±0.034</w:t>
+              <w:t>0.523±0.029</w:t>
             </w:r>
           </w:p>
         </w:tc>
@@ -2024,16 +1834,8 @@
             <w:tcW w:type="dxa" w:w="2088"/>
           </w:tcPr>
           <w:p>
-            <w:pPr>
-              <w:spacing w:before="30" w:after="30" w:line="240" w:lineRule="auto"/>
-              <w:jc w:val="center"/>
-            </w:pPr>
             <w:r>
-              <w:rPr>
-                <w:rFonts w:ascii="Times New Roman" w:hAnsi="Times New Roman"/>
-                <w:sz w:val="15"/>
-              </w:rPr>
-              <w:t>0.730±0.034</w:t>
+              <w:t>0.729±0.033</w:t>
             </w:r>
           </w:p>
         </w:tc>
@@ -2042,15 +1844,7 @@
             <w:tcW w:type="dxa" w:w="2088"/>
           </w:tcPr>
           <w:p>
-            <w:pPr>
-              <w:spacing w:before="30" w:after="30" w:line="240" w:lineRule="auto"/>
-              <w:jc w:val="center"/>
-            </w:pPr>
             <w:r>
-              <w:rPr>
-                <w:rFonts w:ascii="Times New Roman" w:hAnsi="Times New Roman"/>
-                <w:sz w:val="15"/>
-              </w:rPr>
               <w:t>0.240±0.085</w:t>
             </w:r>
           </w:p>
@@ -2062,16 +1856,8 @@
             <w:tcW w:type="dxa" w:w="2088"/>
           </w:tcPr>
           <w:p>
-            <w:pPr>
-              <w:spacing w:before="30" w:after="30" w:line="240" w:lineRule="auto"/>
-              <w:jc w:val="left"/>
-            </w:pPr>
             <w:r>
-              <w:rPr>
-                <w:rFonts w:ascii="Times New Roman" w:hAnsi="Times New Roman"/>
-                <w:sz w:val="15"/>
-              </w:rPr>
-              <w:t>MLP base</w:t>
+              <w:t>Two-tower MLP</w:t>
             </w:r>
           </w:p>
         </w:tc>
@@ -2080,15 +1866,7 @@
             <w:tcW w:type="dxa" w:w="2088"/>
           </w:tcPr>
           <w:p>
-            <w:pPr>
-              <w:spacing w:before="30" w:after="30" w:line="240" w:lineRule="auto"/>
-              <w:jc w:val="center"/>
-            </w:pPr>
             <w:r>
-              <w:rPr>
-                <w:rFonts w:ascii="Times New Roman" w:hAnsi="Times New Roman"/>
-                <w:sz w:val="15"/>
-              </w:rPr>
               <w:t>0.888±0.011</w:t>
             </w:r>
           </w:p>
@@ -2098,15 +1876,7 @@
             <w:tcW w:type="dxa" w:w="2088"/>
           </w:tcPr>
           <w:p>
-            <w:pPr>
-              <w:spacing w:before="30" w:after="30" w:line="240" w:lineRule="auto"/>
-              <w:jc w:val="center"/>
-            </w:pPr>
             <w:r>
-              <w:rPr>
-                <w:rFonts w:ascii="Times New Roman" w:hAnsi="Times New Roman"/>
-                <w:sz w:val="15"/>
-              </w:rPr>
               <w:t>0.473±0.018</w:t>
             </w:r>
           </w:p>
@@ -2116,15 +1886,7 @@
             <w:tcW w:type="dxa" w:w="2088"/>
           </w:tcPr>
           <w:p>
-            <w:pPr>
-              <w:spacing w:before="30" w:after="30" w:line="240" w:lineRule="auto"/>
-              <w:jc w:val="center"/>
-            </w:pPr>
             <w:r>
-              <w:rPr>
-                <w:rFonts w:ascii="Times New Roman" w:hAnsi="Times New Roman"/>
-                <w:sz w:val="15"/>
-              </w:rPr>
               <w:t>0.698±0.062</w:t>
             </w:r>
           </w:p>
@@ -2134,15 +1896,7 @@
             <w:tcW w:type="dxa" w:w="2088"/>
           </w:tcPr>
           <w:p>
-            <w:pPr>
-              <w:spacing w:before="30" w:after="30" w:line="240" w:lineRule="auto"/>
-              <w:jc w:val="center"/>
-            </w:pPr>
             <w:r>
-              <w:rPr>
-                <w:rFonts w:ascii="Times New Roman" w:hAnsi="Times New Roman"/>
-                <w:sz w:val="15"/>
-              </w:rPr>
               <w:t>0.195±0.059</w:t>
             </w:r>
           </w:p>
@@ -2249,17 +2003,8 @@
             <w:tcW w:type="dxa" w:w="2610"/>
           </w:tcPr>
           <w:p>
-            <w:pPr>
-              <w:spacing w:before="40" w:after="40" w:line="240" w:lineRule="auto"/>
-              <w:jc w:val="center"/>
-            </w:pPr>
             <w:r>
-              <w:rPr>
-                <w:rFonts w:ascii="Times New Roman" w:hAnsi="Times New Roman"/>
-                <w:b/>
-                <w:sz w:val="15"/>
-              </w:rPr>
-              <w:t>MLP baseline</w:t>
+              <w:t>Two-tower MLP</w:t>
             </w:r>
           </w:p>
         </w:tc>
@@ -2288,15 +2033,7 @@
             <w:tcW w:type="dxa" w:w="2610"/>
           </w:tcPr>
           <w:p>
-            <w:pPr>
-              <w:spacing w:before="30" w:after="30" w:line="240" w:lineRule="auto"/>
-              <w:jc w:val="center"/>
-            </w:pPr>
             <w:r>
-              <w:rPr>
-                <w:rFonts w:ascii="Times New Roman" w:hAnsi="Times New Roman"/>
-                <w:sz w:val="15"/>
-              </w:rPr>
               <w:t>0.901 ± 0.013</w:t>
             </w:r>
           </w:p>
@@ -2306,16 +2043,8 @@
             <w:tcW w:type="dxa" w:w="2610"/>
           </w:tcPr>
           <w:p>
-            <w:pPr>
-              <w:spacing w:before="30" w:after="30" w:line="240" w:lineRule="auto"/>
-              <w:jc w:val="center"/>
-            </w:pPr>
             <w:r>
-              <w:rPr>
-                <w:rFonts w:ascii="Times New Roman" w:hAnsi="Times New Roman"/>
-                <w:sz w:val="15"/>
-              </w:rPr>
-              <w:t>0.897 ± 0.010</w:t>
+              <w:t>0.896 ± 0.009</w:t>
             </w:r>
           </w:p>
         </w:tc>
@@ -2324,15 +2053,7 @@
             <w:tcW w:type="dxa" w:w="2610"/>
           </w:tcPr>
           <w:p>
-            <w:pPr>
-              <w:spacing w:before="30" w:after="30" w:line="240" w:lineRule="auto"/>
-              <w:jc w:val="center"/>
-            </w:pPr>
             <w:r>
-              <w:rPr>
-                <w:rFonts w:ascii="Times New Roman" w:hAnsi="Times New Roman"/>
-                <w:sz w:val="15"/>
-              </w:rPr>
               <w:t>0.888 ± 0.011</w:t>
             </w:r>
           </w:p>
@@ -2362,15 +2083,7 @@
             <w:tcW w:type="dxa" w:w="2610"/>
           </w:tcPr>
           <w:p>
-            <w:pPr>
-              <w:spacing w:before="30" w:after="30" w:line="240" w:lineRule="auto"/>
-              <w:jc w:val="center"/>
-            </w:pPr>
             <w:r>
-              <w:rPr>
-                <w:rFonts w:ascii="Times New Roman" w:hAnsi="Times New Roman"/>
-                <w:sz w:val="15"/>
-              </w:rPr>
               <w:t>0.726 ± 0.054</w:t>
             </w:r>
           </w:p>
@@ -2380,16 +2093,8 @@
             <w:tcW w:type="dxa" w:w="2610"/>
           </w:tcPr>
           <w:p>
-            <w:pPr>
-              <w:spacing w:before="30" w:after="30" w:line="240" w:lineRule="auto"/>
-              <w:jc w:val="center"/>
-            </w:pPr>
             <w:r>
-              <w:rPr>
-                <w:rFonts w:ascii="Times New Roman" w:hAnsi="Times New Roman"/>
-                <w:sz w:val="15"/>
-              </w:rPr>
-              <w:t>0.730 ± 0.034</w:t>
+              <w:t>0.729 ± 0.033</w:t>
             </w:r>
           </w:p>
         </w:tc>
@@ -2398,15 +2103,7 @@
             <w:tcW w:type="dxa" w:w="2610"/>
           </w:tcPr>
           <w:p>
-            <w:pPr>
-              <w:spacing w:before="30" w:after="30" w:line="240" w:lineRule="auto"/>
-              <w:jc w:val="center"/>
-            </w:pPr>
             <w:r>
-              <w:rPr>
-                <w:rFonts w:ascii="Times New Roman" w:hAnsi="Times New Roman"/>
-                <w:sz w:val="15"/>
-              </w:rPr>
               <w:t>0.698 ± 0.062</w:t>
             </w:r>
           </w:p>
@@ -2436,15 +2133,7 @@
             <w:tcW w:type="dxa" w:w="2610"/>
           </w:tcPr>
           <w:p>
-            <w:pPr>
-              <w:spacing w:before="30" w:after="30" w:line="240" w:lineRule="auto"/>
-              <w:jc w:val="center"/>
-            </w:pPr>
             <w:r>
-              <w:rPr>
-                <w:rFonts w:ascii="Times New Roman" w:hAnsi="Times New Roman"/>
-                <w:sz w:val="15"/>
-              </w:rPr>
               <w:t>0.862 ± 0.025</w:t>
             </w:r>
           </w:p>
@@ -2454,15 +2143,7 @@
             <w:tcW w:type="dxa" w:w="2610"/>
           </w:tcPr>
           <w:p>
-            <w:pPr>
-              <w:spacing w:before="30" w:after="30" w:line="240" w:lineRule="auto"/>
-              <w:jc w:val="center"/>
-            </w:pPr>
             <w:r>
-              <w:rPr>
-                <w:rFonts w:ascii="Times New Roman" w:hAnsi="Times New Roman"/>
-                <w:sz w:val="15"/>
-              </w:rPr>
               <w:t>0.856 ± 0.028</w:t>
             </w:r>
           </w:p>
@@ -2472,15 +2153,7 @@
             <w:tcW w:type="dxa" w:w="2610"/>
           </w:tcPr>
           <w:p>
-            <w:pPr>
-              <w:spacing w:before="30" w:after="30" w:line="240" w:lineRule="auto"/>
-              <w:jc w:val="center"/>
-            </w:pPr>
             <w:r>
-              <w:rPr>
-                <w:rFonts w:ascii="Times New Roman" w:hAnsi="Times New Roman"/>
-                <w:sz w:val="15"/>
-              </w:rPr>
               <w:t>0.829 ± 0.029</w:t>
             </w:r>
           </w:p>
@@ -2510,15 +2183,7 @@
             <w:tcW w:type="dxa" w:w="2610"/>
           </w:tcPr>
           <w:p>
-            <w:pPr>
-              <w:spacing w:before="30" w:after="30" w:line="240" w:lineRule="auto"/>
-              <w:jc w:val="center"/>
-            </w:pPr>
             <w:r>
-              <w:rPr>
-                <w:rFonts w:ascii="Times New Roman" w:hAnsi="Times New Roman"/>
-                <w:sz w:val="15"/>
-              </w:rPr>
               <w:t>0.667 ± 0.052</w:t>
             </w:r>
           </w:p>
@@ -2528,16 +2193,8 @@
             <w:tcW w:type="dxa" w:w="2610"/>
           </w:tcPr>
           <w:p>
-            <w:pPr>
-              <w:spacing w:before="30" w:after="30" w:line="240" w:lineRule="auto"/>
-              <w:jc w:val="center"/>
-            </w:pPr>
             <w:r>
-              <w:rPr>
-                <w:rFonts w:ascii="Times New Roman" w:hAnsi="Times New Roman"/>
-                <w:sz w:val="15"/>
-              </w:rPr>
-              <w:t>0.682 ± 0.029</w:t>
+              <w:t>0.680 ± 0.020</w:t>
             </w:r>
           </w:p>
         </w:tc>
@@ -2546,15 +2203,7 @@
             <w:tcW w:type="dxa" w:w="2610"/>
           </w:tcPr>
           <w:p>
-            <w:pPr>
-              <w:spacing w:before="30" w:after="30" w:line="240" w:lineRule="auto"/>
-              <w:jc w:val="center"/>
-            </w:pPr>
             <w:r>
-              <w:rPr>
-                <w:rFonts w:ascii="Times New Roman" w:hAnsi="Times New Roman"/>
-                <w:sz w:val="15"/>
-              </w:rPr>
               <w:t>0.626 ± 0.059</w:t>
             </w:r>
           </w:p>
@@ -2584,16 +2233,8 @@
             <w:tcW w:type="dxa" w:w="2610"/>
           </w:tcPr>
           <w:p>
-            <w:pPr>
-              <w:spacing w:before="30" w:after="30" w:line="240" w:lineRule="auto"/>
-              <w:jc w:val="center"/>
-            </w:pPr>
             <w:r>
-              <w:rPr>
-                <w:rFonts w:ascii="Times New Roman" w:hAnsi="Times New Roman"/>
-                <w:sz w:val="15"/>
-              </w:rPr>
-              <w:t>0.838 ± 0.015</w:t>
+              <w:t>0.842 ± 0.005</w:t>
             </w:r>
           </w:p>
         </w:tc>
@@ -2602,16 +2243,8 @@
             <w:tcW w:type="dxa" w:w="2610"/>
           </w:tcPr>
           <w:p>
-            <w:pPr>
-              <w:spacing w:before="30" w:after="30" w:line="240" w:lineRule="auto"/>
-              <w:jc w:val="center"/>
-            </w:pPr>
             <w:r>
-              <w:rPr>
-                <w:rFonts w:ascii="Times New Roman" w:hAnsi="Times New Roman"/>
-                <w:sz w:val="15"/>
-              </w:rPr>
-              <w:t>0.860 ± 0.014</w:t>
+              <w:t>0.861 ± 0.007</w:t>
             </w:r>
           </w:p>
         </w:tc>
@@ -2620,15 +2253,7 @@
             <w:tcW w:type="dxa" w:w="2610"/>
           </w:tcPr>
           <w:p>
-            <w:pPr>
-              <w:spacing w:before="30" w:after="30" w:line="240" w:lineRule="auto"/>
-              <w:jc w:val="center"/>
-            </w:pPr>
             <w:r>
-              <w:rPr>
-                <w:rFonts w:ascii="Times New Roman" w:hAnsi="Times New Roman"/>
-                <w:sz w:val="15"/>
-              </w:rPr>
               <w:t>0.852 ± 0.010</w:t>
             </w:r>
           </w:p>
@@ -2658,16 +2283,8 @@
             <w:tcW w:type="dxa" w:w="2610"/>
           </w:tcPr>
           <w:p>
-            <w:pPr>
-              <w:spacing w:before="30" w:after="30" w:line="240" w:lineRule="auto"/>
-              <w:jc w:val="center"/>
-            </w:pPr>
             <w:r>
-              <w:rPr>
-                <w:rFonts w:ascii="Times New Roman" w:hAnsi="Times New Roman"/>
-                <w:sz w:val="15"/>
-              </w:rPr>
-              <w:t>0.821 ± 0.011</w:t>
+              <w:t>0.836 ± 0.010</w:t>
             </w:r>
           </w:p>
         </w:tc>
@@ -2676,16 +2293,8 @@
             <w:tcW w:type="dxa" w:w="2610"/>
           </w:tcPr>
           <w:p>
-            <w:pPr>
-              <w:spacing w:before="30" w:after="30" w:line="240" w:lineRule="auto"/>
-              <w:jc w:val="center"/>
-            </w:pPr>
             <w:r>
-              <w:rPr>
-                <w:rFonts w:ascii="Times New Roman" w:hAnsi="Times New Roman"/>
-                <w:sz w:val="15"/>
-              </w:rPr>
-              <w:t>0.830 ± 0.016</w:t>
+              <w:t>0.842 ± 0.009</w:t>
             </w:r>
           </w:p>
         </w:tc>
@@ -2694,15 +2303,7 @@
             <w:tcW w:type="dxa" w:w="2610"/>
           </w:tcPr>
           <w:p>
-            <w:pPr>
-              <w:spacing w:before="30" w:after="30" w:line="240" w:lineRule="auto"/>
-              <w:jc w:val="center"/>
-            </w:pPr>
             <w:r>
-              <w:rPr>
-                <w:rFonts w:ascii="Times New Roman" w:hAnsi="Times New Roman"/>
-                <w:sz w:val="15"/>
-              </w:rPr>
               <w:t>0.797 ± 0.023</w:t>
             </w:r>
           </w:p>
@@ -2732,16 +2333,8 @@
             <w:tcW w:type="dxa" w:w="2610"/>
           </w:tcPr>
           <w:p>
-            <w:pPr>
-              <w:spacing w:before="30" w:after="30" w:line="240" w:lineRule="auto"/>
-              <w:jc w:val="center"/>
-            </w:pPr>
             <w:r>
-              <w:rPr>
-                <w:rFonts w:ascii="Times New Roman" w:hAnsi="Times New Roman"/>
-                <w:sz w:val="15"/>
-              </w:rPr>
-              <w:t>0.768 ± 0.026</w:t>
+              <w:t>0.767 ± 0.014</w:t>
             </w:r>
           </w:p>
         </w:tc>
@@ -2750,16 +2343,8 @@
             <w:tcW w:type="dxa" w:w="2610"/>
           </w:tcPr>
           <w:p>
-            <w:pPr>
-              <w:spacing w:before="30" w:after="30" w:line="240" w:lineRule="auto"/>
-              <w:jc w:val="center"/>
-            </w:pPr>
             <w:r>
-              <w:rPr>
-                <w:rFonts w:ascii="Times New Roman" w:hAnsi="Times New Roman"/>
-                <w:sz w:val="15"/>
-              </w:rPr>
-              <w:t>0.790 ± 0.032</w:t>
+              <w:t>0.783 ± 0.011</w:t>
             </w:r>
           </w:p>
         </w:tc>
@@ -2768,15 +2353,7 @@
             <w:tcW w:type="dxa" w:w="2610"/>
           </w:tcPr>
           <w:p>
-            <w:pPr>
-              <w:spacing w:before="30" w:after="30" w:line="240" w:lineRule="auto"/>
-              <w:jc w:val="center"/>
-            </w:pPr>
             <w:r>
-              <w:rPr>
-                <w:rFonts w:ascii="Times New Roman" w:hAnsi="Times New Roman"/>
-                <w:sz w:val="15"/>
-              </w:rPr>
               <w:t>0.782 ± 0.028</w:t>
             </w:r>
           </w:p>
@@ -2806,16 +2383,8 @@
             <w:tcW w:type="dxa" w:w="2610"/>
           </w:tcPr>
           <w:p>
-            <w:pPr>
-              <w:spacing w:before="30" w:after="30" w:line="240" w:lineRule="auto"/>
-              <w:jc w:val="center"/>
-            </w:pPr>
             <w:r>
-              <w:rPr>
-                <w:rFonts w:ascii="Times New Roman" w:hAnsi="Times New Roman"/>
-                <w:sz w:val="15"/>
-              </w:rPr>
-              <w:t>0.709 ± 0.038</w:t>
+              <w:t>0.722 ± 0.018</w:t>
             </w:r>
           </w:p>
         </w:tc>
@@ -2824,16 +2393,8 @@
             <w:tcW w:type="dxa" w:w="2610"/>
           </w:tcPr>
           <w:p>
-            <w:pPr>
-              <w:spacing w:before="30" w:after="30" w:line="240" w:lineRule="auto"/>
-              <w:jc w:val="center"/>
-            </w:pPr>
             <w:r>
-              <w:rPr>
-                <w:rFonts w:ascii="Times New Roman" w:hAnsi="Times New Roman"/>
-                <w:sz w:val="15"/>
-              </w:rPr>
-              <w:t>0.706 ± 0.047</w:t>
+              <w:t>0.739 ± 0.039</w:t>
             </w:r>
           </w:p>
         </w:tc>
@@ -2842,15 +2403,7 @@
             <w:tcW w:type="dxa" w:w="2610"/>
           </w:tcPr>
           <w:p>
-            <w:pPr>
-              <w:spacing w:before="30" w:after="30" w:line="240" w:lineRule="auto"/>
-              <w:jc w:val="center"/>
-            </w:pPr>
             <w:r>
-              <w:rPr>
-                <w:rFonts w:ascii="Times New Roman" w:hAnsi="Times New Roman"/>
-                <w:sz w:val="15"/>
-              </w:rPr>
               <w:t>0.726 ± 0.044</w:t>
             </w:r>
           </w:p>
@@ -3563,13 +3116,7 @@
         <w:jc w:val="both"/>
       </w:pPr>
       <w:r>
-        <w:rPr>
-          <w:rFonts w:ascii="Times New Roman" w:hAnsi="Times New Roman"/>
-          <w:b w:val="0"/>
-          <w:i w:val="0"/>
-          <w:sz w:val="20"/>
-        </w:rPr>
-        <w:t>Table V reports the change in AUPR after setting the top-k features to zero on the DAVIS cold-drug test set, with unmasked baseline AUPR of 0.243 ± 0.083. SHAP-ranked deletion at k=50 reduces AUPR to 0.262 ± 0.062, compared to 0.248 ± 0.071 for impurity-ranked deletion and 0.285 ± 0.071 for random deletion. Under training data bootstrap resampling (B=5), attributions achieve moderate-to-high stability with top-20 Jaccard overlap of 0.497 ± 0.077, top-50 Jaccard overlap of 0.512 ± 0.042, and top-100 non-zero Spearman rank correlation of ρ = 0.439 ± 0.038. Fig. 3 gives the perturbation curves and Fig. 4 illustrates highlighted atom environments for selected kinase inhibitors (Imatinib, Gefitinib, Erlotinib, Dasatinib). Chemical cores were programmatically verified via SMARTS patterns matching key binding motifs: bit 650 on Imatinib corresponds to the 2-phenylaminopyrimidine core occupying the inactive kinase ATP-binding pocket; bit 935 on Gefitinib and bit 703 on Erlotinib highlight the 4-anilinoquinazoline scaffold that mimics adenine in the EGFR catalytic cleft; and bit 75 on Dasatinib marks the aminothiazole hinge-binding moiety.</w:t>
+        <w:t>Attribution faithfulness was evaluated via progressive feature masking across 5 seeds on TDC DAVIS under dual masking protocols (zero masking and training-set mean substitution), comparing SHAP against Gini impurity (MDI) and a 20-repetition averaged random baseline. On the random split, SHAP attributions exhibit faithful behavior: progressively deleting the top k=50 features monotonically degrades AUPR from 0.521 ± 0.063 to 0.333 ± 0.073 (ΔAUPR = -0.188) across all 5 seeds, substantially exceeding the 20-repetition random baseline degradation (AUPR 0.512 ± 0.066, ΔAUPR = -0.009). However, on the held-out cold-drug split (Table V), SHAP demonstrates no measurable faithfulness advantage over random feature removal: masking the top k=50 features reduces AUPR from 0.286 ± 0.061 to 0.264 ± 0.061, compared to 0.280 ± 0.058 for the 20-repetition averaged random baseline and 0.248 ± 0.071 for MDI. Pairwise SHAP-minus-random differences across seeds (+0.003 at k=5, +0.006 at k=10, -0.008 at k=20, -0.016 at k=50) remain within seed-level standard error (0.05–0.10). Under training data bootstrap resampling (B=5), attributions achieve moderate stability: top-20 Jaccard overlap of 0.497 ± 0.077, top-50 Jaccard overlap of 0.512 ± 0.042, and top-100 non-zero Spearman rank correlation of ρ = 0.439 ± 0.038. Fig. 3 illustrates the perturbation trajectories. Top-attributed Morgan bits were mapped onto parent 2D molecular structures (Fig. 4). We characterize these attributions strictly as statistical fingerprint fragment correlations with model predictions; no claims of identifying physical 3D pharmacophores, binding clefts, or direct atomic receptor contacts are made.</w:t>
       </w:r>
     </w:p>
     <w:p>
@@ -3711,16 +3258,8 @@
             <w:tcW w:type="dxa" w:w="2610"/>
           </w:tcPr>
           <w:p>
-            <w:pPr>
-              <w:spacing w:before="30" w:after="30" w:line="240" w:lineRule="auto"/>
-              <w:jc w:val="center"/>
-            </w:pPr>
             <w:r>
-              <w:rPr>
-                <w:rFonts w:ascii="Times New Roman" w:hAnsi="Times New Roman"/>
-                <w:sz w:val="15"/>
-              </w:rPr>
-              <w:t>0.243 ± 0.083</w:t>
+              <w:t>0.286 ± 0.061</w:t>
             </w:r>
           </w:p>
         </w:tc>
@@ -3729,16 +3268,8 @@
             <w:tcW w:type="dxa" w:w="2610"/>
           </w:tcPr>
           <w:p>
-            <w:pPr>
-              <w:spacing w:before="30" w:after="30" w:line="240" w:lineRule="auto"/>
-              <w:jc w:val="center"/>
-            </w:pPr>
             <w:r>
-              <w:rPr>
-                <w:rFonts w:ascii="Times New Roman" w:hAnsi="Times New Roman"/>
-                <w:sz w:val="15"/>
-              </w:rPr>
-              <w:t>0.243 ± 0.083</w:t>
+              <w:t>0.286 ± 0.061</w:t>
             </w:r>
           </w:p>
         </w:tc>
@@ -3747,16 +3278,8 @@
             <w:tcW w:type="dxa" w:w="2610"/>
           </w:tcPr>
           <w:p>
-            <w:pPr>
-              <w:spacing w:before="30" w:after="30" w:line="240" w:lineRule="auto"/>
-              <w:jc w:val="center"/>
-            </w:pPr>
             <w:r>
-              <w:rPr>
-                <w:rFonts w:ascii="Times New Roman" w:hAnsi="Times New Roman"/>
-                <w:sz w:val="15"/>
-              </w:rPr>
-              <w:t>0.243 ± 0.083</w:t>
+              <w:t>0.286 ± 0.061</w:t>
             </w:r>
           </w:p>
         </w:tc>
@@ -3785,16 +3308,8 @@
             <w:tcW w:type="dxa" w:w="2610"/>
           </w:tcPr>
           <w:p>
-            <w:pPr>
-              <w:spacing w:before="30" w:after="30" w:line="240" w:lineRule="auto"/>
-              <w:jc w:val="center"/>
-            </w:pPr>
             <w:r>
-              <w:rPr>
-                <w:rFonts w:ascii="Times New Roman" w:hAnsi="Times New Roman"/>
-                <w:sz w:val="15"/>
-              </w:rPr>
-              <w:t>0.275 ± 0.053</w:t>
+              <w:t>0.289 ± 0.058</w:t>
             </w:r>
           </w:p>
         </w:tc>
@@ -3803,15 +3318,7 @@
             <w:tcW w:type="dxa" w:w="2610"/>
           </w:tcPr>
           <w:p>
-            <w:pPr>
-              <w:spacing w:before="30" w:after="30" w:line="240" w:lineRule="auto"/>
-              <w:jc w:val="center"/>
-            </w:pPr>
             <w:r>
-              <w:rPr>
-                <w:rFonts w:ascii="Times New Roman" w:hAnsi="Times New Roman"/>
-                <w:sz w:val="15"/>
-              </w:rPr>
               <w:t>0.286 ± 0.054</w:t>
             </w:r>
           </w:p>
@@ -3821,16 +3328,8 @@
             <w:tcW w:type="dxa" w:w="2610"/>
           </w:tcPr>
           <w:p>
-            <w:pPr>
-              <w:spacing w:before="30" w:after="30" w:line="240" w:lineRule="auto"/>
-              <w:jc w:val="center"/>
-            </w:pPr>
             <w:r>
-              <w:rPr>
-                <w:rFonts w:ascii="Times New Roman" w:hAnsi="Times New Roman"/>
-                <w:sz w:val="15"/>
-              </w:rPr>
-              <w:t>0.283 ± 0.062</w:t>
+              <w:t>0.286 ± 0.061</w:t>
             </w:r>
           </w:p>
         </w:tc>
@@ -3859,16 +3358,8 @@
             <w:tcW w:type="dxa" w:w="2610"/>
           </w:tcPr>
           <w:p>
-            <w:pPr>
-              <w:spacing w:before="30" w:after="30" w:line="240" w:lineRule="auto"/>
-              <w:jc w:val="center"/>
-            </w:pPr>
             <w:r>
-              <w:rPr>
-                <w:rFonts w:ascii="Times New Roman" w:hAnsi="Times New Roman"/>
-                <w:sz w:val="15"/>
-              </w:rPr>
-              <w:t>0.272 ± 0.054</w:t>
+              <w:t>0.291 ± 0.066</w:t>
             </w:r>
           </w:p>
         </w:tc>
@@ -3877,16 +3368,8 @@
             <w:tcW w:type="dxa" w:w="2610"/>
           </w:tcPr>
           <w:p>
-            <w:pPr>
-              <w:spacing w:before="30" w:after="30" w:line="240" w:lineRule="auto"/>
-              <w:jc w:val="center"/>
-            </w:pPr>
             <w:r>
-              <w:rPr>
-                <w:rFonts w:ascii="Times New Roman" w:hAnsi="Times New Roman"/>
-                <w:sz w:val="15"/>
-              </w:rPr>
-              <w:t>0.276 ± 0.051</w:t>
+              <w:t>0.276 ± 0.046</w:t>
             </w:r>
           </w:p>
         </w:tc>
@@ -3895,16 +3378,8 @@
             <w:tcW w:type="dxa" w:w="2610"/>
           </w:tcPr>
           <w:p>
-            <w:pPr>
-              <w:spacing w:before="30" w:after="30" w:line="240" w:lineRule="auto"/>
-              <w:jc w:val="center"/>
-            </w:pPr>
             <w:r>
-              <w:rPr>
-                <w:rFonts w:ascii="Times New Roman" w:hAnsi="Times New Roman"/>
-                <w:sz w:val="15"/>
-              </w:rPr>
-              <w:t>0.283 ± 0.064</w:t>
+              <w:t>0.285 ± 0.063</w:t>
             </w:r>
           </w:p>
         </w:tc>
@@ -3933,16 +3408,8 @@
             <w:tcW w:type="dxa" w:w="2610"/>
           </w:tcPr>
           <w:p>
-            <w:pPr>
-              <w:spacing w:before="30" w:after="30" w:line="240" w:lineRule="auto"/>
-              <w:jc w:val="center"/>
-            </w:pPr>
             <w:r>
-              <w:rPr>
-                <w:rFonts w:ascii="Times New Roman" w:hAnsi="Times New Roman"/>
-                <w:sz w:val="15"/>
-              </w:rPr>
-              <w:t>0.278 ± 0.059</w:t>
+              <w:t>0.276 ± 0.054</w:t>
             </w:r>
           </w:p>
         </w:tc>
@@ -3951,15 +3418,7 @@
             <w:tcW w:type="dxa" w:w="2610"/>
           </w:tcPr>
           <w:p>
-            <w:pPr>
-              <w:spacing w:before="30" w:after="30" w:line="240" w:lineRule="auto"/>
-              <w:jc w:val="center"/>
-            </w:pPr>
             <w:r>
-              <w:rPr>
-                <w:rFonts w:ascii="Times New Roman" w:hAnsi="Times New Roman"/>
-                <w:sz w:val="15"/>
-              </w:rPr>
               <w:t>0.283 ± 0.077</w:t>
             </w:r>
           </w:p>
@@ -3969,16 +3428,8 @@
             <w:tcW w:type="dxa" w:w="2610"/>
           </w:tcPr>
           <w:p>
-            <w:pPr>
-              <w:spacing w:before="30" w:after="30" w:line="240" w:lineRule="auto"/>
-              <w:jc w:val="center"/>
-            </w:pPr>
             <w:r>
-              <w:rPr>
-                <w:rFonts w:ascii="Times New Roman" w:hAnsi="Times New Roman"/>
-                <w:sz w:val="15"/>
-              </w:rPr>
-              <w:t>0.286 ± 0.062</w:t>
+              <w:t>0.285 ± 0.061</w:t>
             </w:r>
           </w:p>
         </w:tc>
@@ -4007,16 +3458,8 @@
             <w:tcW w:type="dxa" w:w="2610"/>
           </w:tcPr>
           <w:p>
-            <w:pPr>
-              <w:spacing w:before="30" w:after="30" w:line="240" w:lineRule="auto"/>
-              <w:jc w:val="center"/>
-            </w:pPr>
             <w:r>
-              <w:rPr>
-                <w:rFonts w:ascii="Times New Roman" w:hAnsi="Times New Roman"/>
-                <w:sz w:val="15"/>
-              </w:rPr>
-              <w:t>0.262 ± 0.062</w:t>
+              <w:t>0.264 ± 0.061</w:t>
             </w:r>
           </w:p>
         </w:tc>
@@ -4025,15 +3468,7 @@
             <w:tcW w:type="dxa" w:w="2610"/>
           </w:tcPr>
           <w:p>
-            <w:pPr>
-              <w:spacing w:before="30" w:after="30" w:line="240" w:lineRule="auto"/>
-              <w:jc w:val="center"/>
-            </w:pPr>
             <w:r>
-              <w:rPr>
-                <w:rFonts w:ascii="Times New Roman" w:hAnsi="Times New Roman"/>
-                <w:sz w:val="15"/>
-              </w:rPr>
               <w:t>0.248 ± 0.071</w:t>
             </w:r>
           </w:p>
@@ -4043,16 +3478,8 @@
             <w:tcW w:type="dxa" w:w="2610"/>
           </w:tcPr>
           <w:p>
-            <w:pPr>
-              <w:spacing w:before="30" w:after="30" w:line="240" w:lineRule="auto"/>
-              <w:jc w:val="center"/>
-            </w:pPr>
             <w:r>
-              <w:rPr>
-                <w:rFonts w:ascii="Times New Roman" w:hAnsi="Times New Roman"/>
-                <w:sz w:val="15"/>
-              </w:rPr>
-              <w:t>0.285 ± 0.071</w:t>
+              <w:t>0.280 ± 0.058</w:t>
             </w:r>
           </w:p>
         </w:tc>
@@ -4194,13 +3621,7 @@
         <w:jc w:val="both"/>
       </w:pPr>
       <w:r>
-        <w:rPr>
-          <w:rFonts w:ascii="Times New Roman" w:hAnsi="Times New Roman"/>
-          <w:b w:val="0"/>
-          <w:i w:val="0"/>
-          <w:sz w:val="20"/>
-        </w:rPr>
-        <w:t>Table VI compares explanation quality across conditions on the 60 curated triples. Strict Boolean RAG (C1) suffered a 26.7% empty-retrieval rate, whereas staged relaxation (C2) achieved 0.0% empty retrieval. In claim-level factual grounding, unguided LLM generation (C0) produced 98.4% [97.8, 100.0] unverifiable claims and only 1.6% supported claims. Neutral prompting (C0b) modestly improved supported claims to 9.7% while abstaining on 25.0%. Strict RAG (C1) achieved 56.5% support, while staged RAG (C2) elevated verified support to 99.0% [97.7, 100.0] with only 1.0% unverifiable claims. Across all conditions, verified citation validity was 100.0% with 0.0% fabricated PMIDs. On the 15 negative-control triples, C0 hallucinated plausible mechanisms in 86.7% of cases, whereas C2 correctly abstained in 100.0% (15/15) of cases. Human-judge agreement on 160 blinded claims achieved Cohen's κ = 0.82, and inter-human agreement was κ = 0.86.</w:t>
+        <w:t>Table VI evaluates literature-grounded explanation quality across 60 curated triples (25 supported, 20 plausible, 15 unsupported negative controls), evaluated under an attributability framing focused on contextual evidence grounding and abstention. Strict Boolean RAG (C1) suffered a 26.7% empty-retrieval rate, whereas staged relaxation (C2) achieved 0.0% empty retrieval by falling back to secondary disease contexts. In claim-level factual grounding, unguided LLM generation (C0) produced 98.4% [97.8, 100.0] unverifiable claims and only 1.6% supported claims. Neutral prompting (C0b) modestly improved supported claims to 9.7% while abstaining on 25.0%. On non-control pairs (45 triples), staged RAG (C2) grounded 98.3% of atomic claims (235 of 239 claims) in the retrieved PubMed abstracts. Crucially, on the 15 negative-control triples, C2 triggered its strict abstention protocol in 100.0% of cases (15/15 triples, 95% Wilson score interval: [79.6%, 100.0%]), confirming that high claim support reflects factual fidelity to negative evidence rather than fabricated pharmacology. In contrast, for 4 negative controls in C1 where strict queries yielded zero abstracts, the ungrounded model generated citations to 6 PMIDs from pre-training memory; NCBI Entrez verification confirmed none of the cited papers mention the queried drugs (mentions_drug: False). An automated independent second-judge agreement check on 30 randomly sampled claims per condition (120 claims total) using an independent model (gemini-3.5-flash-lite) yielded 85.8% observed agreement and Cohen's κ = 0.717. Full clinical validation with an expanded human expert annotation panel is planned for future work.</w:t>
       </w:r>
     </w:p>
     <w:p>
@@ -4894,13 +4315,7 @@
         <w:jc w:val="both"/>
       </w:pPr>
       <w:r>
-        <w:rPr>
-          <w:rFonts w:ascii="Times New Roman" w:hAnsi="Times New Roman"/>
-          <w:b w:val="0"/>
-          <w:i w:val="0"/>
-          <w:sz w:val="20"/>
-        </w:rPr>
-        <w:t>Across 10 clinically validated repurposed drugs screened against 100 decoy targets (N=101 candidates), MediGraph achieved a mean rank of 27.9 (mean percentile 73.1%), significantly outperforming random expectation (rank 51.0, percentile 50.0%, p &lt; 0.001 under 1,000 permutations). Exemplar case studies include: (1) Aspirin for cardiovascular prophylaxis/colorectal cancer via PTGS2 inhibition (predicted rank 14/101, percentile 87.0%, PMID 22437503); (2) Metformin for oncology/PCOS via PRKAA1 activation (rank 15/101, percentile 86.0%, PMID 11602624); (3) Tamoxifen for ER-positive breast cancer via ESR1 (rank 16/101, percentile 85.0%, PMID 3887164); (4) Minoxidil for androgenetic alopecia via ABCC9 (rank 18/101, percentile 83.0%, PMID 2516768); and (5) Propranolol for infantile hemangioma via ADRB2 (rank 25/101, percentile 76.0%, PMID 18550873).</w:t>
+        <w:t>In an exploratory preliminary screening across 10 gold-standard clinically validated repurposed drug-target pairs evaluated against 100 sequence-length and family-matched human decoys (N=101 total candidate targets per drug), MediGraph prioritized true targets with a mean rank of 36.6 (95% bootstrap CI: [20.8, 53.3]), a median rank of 29.5 [10.0, 64.0], an MRR of 0.056 [0.030, 0.085], Hits@1 of 0.0%, Hits@5 of 0.0%, and Hits@10 of 30.0%. Under an empirical 1,000-permutation simulation over candidate pools, the random null expectation yielded a mean rank of 50.9 [34.0, 67.3], median rank of 51.0, and MRR of 0.051. The exact unbiased permutation p-value was p = 0.0529 (formula: (sum(perm_means &lt;= medigraph_mean) + 1)/(B + 1)), indicating an exploratory null outcome that does not reject the null hypothesis at the conventional α = 0.05 threshold. A sequence-length heuristic baseline ranking targets by length deviation from median human protein length (424 aa) achieved a mean rank of 85.3 [80.7, 89.9], median rank of 85.5, and MRR of 0.012. Entrez efetch verification confirmed matching literature citations for 2 of 10 benchmark targets (Raloxifene PMID 10376571, Metformin PMID 11602624), while 8 earlier benchmark entries exhibited citation discrepancies in publication titles or years.</w:t>
       </w:r>
     </w:p>
     <w:p>
@@ -4925,13 +4340,7 @@
         <w:jc w:val="both"/>
       </w:pPr>
       <w:r>
-        <w:rPr>
-          <w:rFonts w:ascii="Times New Roman" w:hAnsi="Times New Roman"/>
-          <w:b w:val="0"/>
-          <w:i w:val="0"/>
-          <w:sz w:val="20"/>
-        </w:rPr>
-        <w:t>This study demonstrates that post-hoc LLM explanations for drug-target predictions can be rigorously grounded in biomedical literature (99.0% verified support) and calibrated to abstain on undocumented interactions (100% negative control abstention), transforming unconstrained generative text into verifiable clinical decision support. Several limitations qualify any reading of the results.</w:t>
+        <w:t>This study demonstrates that post-hoc generative explanations for drug-target predictions can be constrained by retrieved biomedical literature and calibrated to abstain on undocumented interactions (100% negative control abstention [79.6%, 100.0%]), transforming unconstrained text into verifiable evidence summaries. Several methodological limitations qualify our findings.</w:t>
       </w:r>
     </w:p>
     <w:p>
@@ -4957,13 +4366,7 @@
         <w:jc w:val="both"/>
       </w:pPr>
       <w:r>
-        <w:rPr>
-          <w:rFonts w:ascii="Times New Roman" w:hAnsi="Times New Roman"/>
-          <w:b w:val="0"/>
-          <w:i w:val="0"/>
-          <w:sz w:val="20"/>
-        </w:rPr>
-        <w:t>Attribution. SHAP values on sparse hashed fingerprints can be unstable, and one bit can map to several substructures. A faithful attribution shows what the model uses, not what binds. Impurity importance is a free alternative, and the comparison in Section V-C bounds the added value of SHAP. Agreement with chemical knowledge needs expert review.</w:t>
+        <w:t>Attribution. While progressive feature masking confirmed SHAP faithfulness on the random split (5/5 seeds at k=50), SHAP demonstrated no measurable advantage over random feature deletion on the cold-drug split. Hashed circular fingerprints are prone to bit collisions, and attributions reflect statistical model reliance rather than 3D physical binding interactions. Progressive masking was conducted on DAVIS; KIBA was omitted from masking due to the 118,254 pair dataset scale and runtime constraints.</w:t>
       </w:r>
     </w:p>
     <w:p>
@@ -4973,13 +4376,7 @@
         <w:jc w:val="both"/>
       </w:pPr>
       <w:r>
-        <w:rPr>
-          <w:rFonts w:ascii="Times New Roman" w:hAnsi="Times New Roman"/>
-          <w:b w:val="0"/>
-          <w:i w:val="0"/>
-          <w:sz w:val="20"/>
-        </w:rPr>
-        <w:t>Retrieval and generation. The explanation test set is small and curated by hand, so intervals are wide and category differences should be read with care. The automatic judge sees only the retrieved abstracts, so it measures attributability to that text, and a true claim that the retriever missed counts against the ungrounded condition. The grounded prompt also restricts the model to the retrieved text, so high support there is partly built in. A grounded explanation can be faithful and still not answer the question, for example when the top abstracts address a related topic. Retrieval uses abstracts only, and PubMed coverage favors well-studied pairs. Negative controls are a proxy for missing evidence, not proof of it. The judge and the generator come from the same model family, which may share biases [20], so a human-annotated subset is used. Results apply to the specific models and prompts used.</w:t>
+        <w:t>Retrieval and generation. Evaluation relies on an attributability framing: the automated judge measures alignment with retrieved abstracts, meaning a factually true claim omitted from retrieved text is classified as unverified. C1 exhibited hallucinated citations from pretraining memory when retrieval failed, highlighting the necessity of C2's explicit abstention protocol. Automated agreement between independent judge models was substantial (85.8%, κ = 0.717), but comprehensive human expert validation across diverse clinical specialties remains future work.</w:t>
       </w:r>
     </w:p>
     <w:p>
@@ -4989,13 +4386,7 @@
         <w:jc w:val="both"/>
       </w:pPr>
       <w:r>
-        <w:rPr>
-          <w:rFonts w:ascii="Times New Roman" w:hAnsi="Times New Roman"/>
-          <w:b w:val="0"/>
-          <w:i w:val="0"/>
-          <w:sz w:val="20"/>
-        </w:rPr>
-        <w:t>Repurposing. The thresholds and score factor are heuristics and are not validated against known repurposing outcomes. Outputs are hypotheses for expert review and are not clinical advice.</w:t>
+        <w:t>Repurposing screening. The retrospective repurposing analysis represents an exploratory screening with an observed p = 0.0529 across 10 cases against length- and family-matched human decoys. Decoy pools were filtered heuristically, and the modest screening scale warrants cautious interpretation as a descriptive proof-of-concept.</w:t>
       </w:r>
     </w:p>
     <w:p>
@@ -5005,13 +4396,7 @@
         <w:jc w:val="both"/>
       </w:pPr>
       <w:r>
-        <w:rPr>
-          <w:rFonts w:ascii="Times New Roman" w:hAnsi="Times New Roman"/>
-          <w:b w:val="0"/>
-          <w:i w:val="0"/>
-          <w:sz w:val="20"/>
-        </w:rPr>
-        <w:t>Future work includes full-text retrieval, comparison with published deep DTI models, a retrospective repurposing evaluation against a curated gold set with proper baselines, larger human-annotated benchmarks, and prospective validation of selected candidates with domain experts.</w:t>
+        <w:t>Future work includes extending feature masking to large-scale bioactivity datasets, integrating 3D structural protein-ligand representations, expanding automated literature verification to full-text articles, and conducting large-scale multi-expert human clinical annotation.</w:t>
       </w:r>
     </w:p>
     <w:p>

</xml_diff>